<commit_message>
docs: added components/containers QA
</commit_message>
<xml_diff>
--- a/Reporte QA.docx
+++ b/Reporte QA.docx
@@ -14,13 +14,50 @@
         <w:rPr>
           <w:lang w:val="es-MX"/>
         </w:rPr>
-        <w:t>BDS</w:t>
-      </w:r>
-      <w:r>
-        <w:rPr>
-          <w:lang w:val="es-MX"/>
-        </w:rPr>
-        <w:t xml:space="preserve"> QA</w:t>
+        <w:t>BDS QA</w:t>
+      </w:r>
+    </w:p>
+    <w:p>
+      <w:pPr>
+        <w:rPr>
+          <w:lang w:val="es-MX"/>
+        </w:rPr>
+      </w:pPr>
+    </w:p>
+    <w:p>
+      <w:pPr>
+        <w:pStyle w:val="Prrafodelista"/>
+        <w:numPr>
+          <w:ilvl w:val="0"/>
+          <w:numId w:val="5"/>
+        </w:numPr>
+        <w:rPr>
+          <w:lang w:val="es-MX"/>
+        </w:rPr>
+      </w:pPr>
+      <w:r>
+        <w:rPr>
+          <w:lang w:val="es-MX"/>
+        </w:rPr>
+        <w:t>Quitar documentacion JSDoc relacionada a tokens</w:t>
+      </w:r>
+    </w:p>
+    <w:p>
+      <w:pPr>
+        <w:pStyle w:val="Prrafodelista"/>
+        <w:numPr>
+          <w:ilvl w:val="0"/>
+          <w:numId w:val="5"/>
+        </w:numPr>
+        <w:rPr>
+          <w:lang w:val="es-MX"/>
+        </w:rPr>
+      </w:pPr>
+      <w:r>
+        <w:rPr>
+          <w:lang w:val="es-MX"/>
+        </w:rPr>
+        <w:t>Introducir ejemplos de uso en la documentacion JSDoc</w:t>
       </w:r>
     </w:p>
     <w:p>
@@ -247,7 +284,17 @@
           <w:szCs w:val="26"/>
           <w:lang w:val="es-MX"/>
         </w:rPr>
-        <w:t>Prop icon es de tipo any</w:t>
+        <w:t xml:space="preserve">Prop icon es de tipo </w:t>
+      </w:r>
+      <w:r>
+        <w:rPr>
+          <w:rFonts w:ascii="Helvetica Neue" w:hAnsi="Helvetica Neue" w:cs="Helvetica Neue"/>
+          <w:kern w:val="0"/>
+          <w:sz w:val="26"/>
+          <w:szCs w:val="26"/>
+          <w:lang w:val="es-MX"/>
+        </w:rPr>
+        <w:t>ReactNode, no es consistente con los demas componentes</w:t>
       </w:r>
     </w:p>
     <w:p>
@@ -491,6 +538,529 @@
         <w:t>Containers</w:t>
       </w:r>
     </w:p>
+    <w:p>
+      <w:pPr>
+        <w:pStyle w:val="Ttulo4"/>
+        <w:rPr>
+          <w:lang w:val="es-MX"/>
+        </w:rPr>
+      </w:pPr>
+      <w:r>
+        <w:rPr>
+          <w:lang w:val="es-MX"/>
+        </w:rPr>
+        <w:t>Accordion</w:t>
+      </w:r>
+    </w:p>
+    <w:p>
+      <w:pPr>
+        <w:pStyle w:val="Prrafodelista"/>
+        <w:numPr>
+          <w:ilvl w:val="0"/>
+          <w:numId w:val="5"/>
+        </w:numPr>
+        <w:rPr>
+          <w:lang w:val="es-MX"/>
+        </w:rPr>
+      </w:pPr>
+      <w:r>
+        <w:rPr>
+          <w:lang w:val="es-MX"/>
+        </w:rPr>
+        <w:t>Prop headingLevel no tiene ningun efecto</w:t>
+      </w:r>
+    </w:p>
+    <w:p>
+      <w:pPr>
+        <w:pStyle w:val="Ttulo4"/>
+        <w:rPr>
+          <w:lang w:val="es-MX"/>
+        </w:rPr>
+      </w:pPr>
+      <w:r>
+        <w:rPr>
+          <w:lang w:val="es-MX"/>
+        </w:rPr>
+        <w:t>AccordionItem</w:t>
+      </w:r>
+    </w:p>
+    <w:p>
+      <w:pPr>
+        <w:pStyle w:val="Prrafodelista"/>
+        <w:numPr>
+          <w:ilvl w:val="0"/>
+          <w:numId w:val="5"/>
+        </w:numPr>
+        <w:rPr>
+          <w:lang w:val="es-MX"/>
+        </w:rPr>
+      </w:pPr>
+      <w:r>
+        <w:rPr>
+          <w:lang w:val="es-MX"/>
+        </w:rPr>
+        <w:t>Prop headinLevel no tiene efecto</w:t>
+      </w:r>
+    </w:p>
+    <w:p>
+      <w:pPr>
+        <w:pStyle w:val="Ttulo4"/>
+        <w:rPr>
+          <w:lang w:val="es-MX"/>
+        </w:rPr>
+      </w:pPr>
+      <w:r>
+        <w:rPr>
+          <w:lang w:val="es-MX"/>
+        </w:rPr>
+        <w:lastRenderedPageBreak/>
+        <w:t>Card</w:t>
+      </w:r>
+    </w:p>
+    <w:p>
+      <w:pPr>
+        <w:pStyle w:val="Prrafodelista"/>
+        <w:numPr>
+          <w:ilvl w:val="0"/>
+          <w:numId w:val="5"/>
+        </w:numPr>
+        <w:rPr>
+          <w:lang w:val="es-MX"/>
+        </w:rPr>
+      </w:pPr>
+      <w:r>
+        <w:rPr>
+          <w:lang w:val="es-MX"/>
+        </w:rPr>
+        <w:t xml:space="preserve">El valor “flat” de la prop </w:t>
+      </w:r>
+      <w:r>
+        <w:rPr>
+          <w:b/>
+          <w:bCs/>
+          <w:lang w:val="es-MX"/>
+        </w:rPr>
+        <w:t>elevation</w:t>
+      </w:r>
+      <w:r>
+        <w:rPr>
+          <w:lang w:val="es-MX"/>
+        </w:rPr>
+        <w:t xml:space="preserve"> no tiene efecto en: Android, iOS</w:t>
+      </w:r>
+    </w:p>
+    <w:p>
+      <w:pPr>
+        <w:pStyle w:val="Prrafodelista"/>
+        <w:numPr>
+          <w:ilvl w:val="0"/>
+          <w:numId w:val="5"/>
+        </w:numPr>
+        <w:rPr>
+          <w:lang w:val="es-MX"/>
+        </w:rPr>
+      </w:pPr>
+      <w:r>
+        <w:rPr>
+          <w:lang w:val="es-MX"/>
+        </w:rPr>
+        <w:t xml:space="preserve">El valor “raised” de la prop </w:t>
+      </w:r>
+      <w:r>
+        <w:rPr>
+          <w:b/>
+          <w:bCs/>
+          <w:lang w:val="es-MX"/>
+        </w:rPr>
+        <w:t>elevation</w:t>
+      </w:r>
+      <w:r>
+        <w:rPr>
+          <w:lang w:val="es-MX"/>
+        </w:rPr>
+        <w:t xml:space="preserve"> no tiene efecto en: Android</w:t>
+      </w:r>
+    </w:p>
+    <w:p>
+      <w:pPr>
+        <w:pStyle w:val="Prrafodelista"/>
+        <w:numPr>
+          <w:ilvl w:val="0"/>
+          <w:numId w:val="5"/>
+        </w:numPr>
+        <w:rPr>
+          <w:lang w:val="es-MX"/>
+        </w:rPr>
+      </w:pPr>
+      <w:r>
+        <w:rPr>
+          <w:lang w:val="es-MX"/>
+        </w:rPr>
+        <w:t xml:space="preserve">No se puede reproducir </w:t>
+      </w:r>
+      <w:r>
+        <w:rPr>
+          <w:b/>
+          <w:bCs/>
+          <w:lang w:val="es-MX"/>
+        </w:rPr>
+        <w:t xml:space="preserve">Tocable </w:t>
+      </w:r>
+      <w:r>
+        <w:rPr>
+          <w:lang w:val="es-MX"/>
+        </w:rPr>
+        <w:t xml:space="preserve">y </w:t>
+      </w:r>
+      <w:r>
+        <w:rPr>
+          <w:b/>
+          <w:bCs/>
+          <w:lang w:val="es-MX"/>
+        </w:rPr>
+        <w:t>Estados</w:t>
+      </w:r>
+    </w:p>
+    <w:p>
+      <w:pPr>
+        <w:rPr>
+          <w:lang w:val="es-MX"/>
+        </w:rPr>
+      </w:pPr>
+      <w:r>
+        <w:rPr>
+          <w:lang w:val="es-MX"/>
+        </w:rPr>
+        <w:drawing>
+          <wp:inline distT="0" distB="0" distL="0" distR="0" wp14:anchorId="7C9352AA" wp14:editId="3AD72D42">
+            <wp:extent cx="3708400" cy="1549400"/>
+            <wp:effectExtent l="0" t="0" r="0" b="0"/>
+            <wp:docPr id="1510823917" name="Imagen 1"/>
+            <wp:cNvGraphicFramePr>
+              <a:graphicFrameLocks xmlns:a="http://schemas.openxmlformats.org/drawingml/2006/main" noChangeAspect="1"/>
+            </wp:cNvGraphicFramePr>
+            <a:graphic xmlns:a="http://schemas.openxmlformats.org/drawingml/2006/main">
+              <a:graphicData uri="http://schemas.openxmlformats.org/drawingml/2006/picture">
+                <pic:pic xmlns:pic="http://schemas.openxmlformats.org/drawingml/2006/picture">
+                  <pic:nvPicPr>
+                    <pic:cNvPr id="1510823917" name=""/>
+                    <pic:cNvPicPr/>
+                  </pic:nvPicPr>
+                  <pic:blipFill>
+                    <a:blip r:embed="rId7"/>
+                    <a:stretch>
+                      <a:fillRect/>
+                    </a:stretch>
+                  </pic:blipFill>
+                  <pic:spPr>
+                    <a:xfrm>
+                      <a:off x="0" y="0"/>
+                      <a:ext cx="3708400" cy="1549400"/>
+                    </a:xfrm>
+                    <a:prstGeom prst="rect">
+                      <a:avLst/>
+                    </a:prstGeom>
+                  </pic:spPr>
+                </pic:pic>
+              </a:graphicData>
+            </a:graphic>
+          </wp:inline>
+        </w:drawing>
+      </w:r>
+    </w:p>
+    <w:p>
+      <w:pPr>
+        <w:pStyle w:val="Ttulo4"/>
+        <w:rPr>
+          <w:lang w:val="es-MX"/>
+        </w:rPr>
+      </w:pPr>
+      <w:r>
+        <w:rPr>
+          <w:lang w:val="es-MX"/>
+        </w:rPr>
+        <w:t>Carousel</w:t>
+      </w:r>
+    </w:p>
+    <w:p>
+      <w:pPr>
+        <w:pStyle w:val="Prrafodelista"/>
+        <w:numPr>
+          <w:ilvl w:val="0"/>
+          <w:numId w:val="5"/>
+        </w:numPr>
+        <w:rPr>
+          <w:lang w:val="es-MX"/>
+        </w:rPr>
+      </w:pPr>
+      <w:r>
+        <w:rPr>
+          <w:lang w:val="es-MX"/>
+        </w:rPr>
+        <w:t>El indicator esta en medio cuando ya se muestra el ultimo item (itemWidht: 100)</w:t>
+      </w:r>
+    </w:p>
+    <w:p>
+      <w:pPr>
+        <w:rPr>
+          <w:lang w:val="es-MX"/>
+        </w:rPr>
+      </w:pPr>
+      <w:r>
+        <w:rPr>
+          <w:lang w:val="es-MX"/>
+        </w:rPr>
+        <w:lastRenderedPageBreak/>
+        <w:drawing>
+          <wp:inline distT="0" distB="0" distL="0" distR="0" wp14:anchorId="123531F9" wp14:editId="1DCAD8CD">
+            <wp:extent cx="4307840" cy="8258810"/>
+            <wp:effectExtent l="0" t="0" r="0" b="0"/>
+            <wp:docPr id="381274409" name="Imagen 1"/>
+            <wp:cNvGraphicFramePr>
+              <a:graphicFrameLocks xmlns:a="http://schemas.openxmlformats.org/drawingml/2006/main" noChangeAspect="1"/>
+            </wp:cNvGraphicFramePr>
+            <a:graphic xmlns:a="http://schemas.openxmlformats.org/drawingml/2006/main">
+              <a:graphicData uri="http://schemas.openxmlformats.org/drawingml/2006/picture">
+                <pic:pic xmlns:pic="http://schemas.openxmlformats.org/drawingml/2006/picture">
+                  <pic:nvPicPr>
+                    <pic:cNvPr id="381274409" name=""/>
+                    <pic:cNvPicPr/>
+                  </pic:nvPicPr>
+                  <pic:blipFill>
+                    <a:blip r:embed="rId8"/>
+                    <a:stretch>
+                      <a:fillRect/>
+                    </a:stretch>
+                  </pic:blipFill>
+                  <pic:spPr>
+                    <a:xfrm>
+                      <a:off x="0" y="0"/>
+                      <a:ext cx="4307840" cy="8258810"/>
+                    </a:xfrm>
+                    <a:prstGeom prst="rect">
+                      <a:avLst/>
+                    </a:prstGeom>
+                  </pic:spPr>
+                </pic:pic>
+              </a:graphicData>
+            </a:graphic>
+          </wp:inline>
+        </w:drawing>
+      </w:r>
+    </w:p>
+    <w:p>
+      <w:pPr>
+        <w:pStyle w:val="Prrafodelista"/>
+        <w:numPr>
+          <w:ilvl w:val="0"/>
+          <w:numId w:val="5"/>
+        </w:numPr>
+        <w:rPr>
+          <w:lang w:val="es-MX"/>
+        </w:rPr>
+      </w:pPr>
+      <w:r>
+        <w:rPr>
+          <w:lang w:val="es-MX"/>
+        </w:rPr>
+        <w:lastRenderedPageBreak/>
+        <w:t>En Android el Carousel se detuvo en medio de 2 items (itemWidht:300, layout: ‘paged’)</w:t>
+      </w:r>
+    </w:p>
+    <w:p>
+      <w:pPr>
+        <w:rPr>
+          <w:lang w:val="es-MX"/>
+        </w:rPr>
+      </w:pPr>
+      <w:r>
+        <w:rPr>
+          <w:lang w:val="es-MX"/>
+        </w:rPr>
+        <w:lastRenderedPageBreak/>
+        <w:drawing>
+          <wp:inline distT="0" distB="0" distL="0" distR="0" wp14:anchorId="54B6654E" wp14:editId="7459515A">
+            <wp:extent cx="4443730" cy="8258810"/>
+            <wp:effectExtent l="0" t="0" r="1270" b="0"/>
+            <wp:docPr id="1779210780" name="Imagen 1"/>
+            <wp:cNvGraphicFramePr>
+              <a:graphicFrameLocks xmlns:a="http://schemas.openxmlformats.org/drawingml/2006/main" noChangeAspect="1"/>
+            </wp:cNvGraphicFramePr>
+            <a:graphic xmlns:a="http://schemas.openxmlformats.org/drawingml/2006/main">
+              <a:graphicData uri="http://schemas.openxmlformats.org/drawingml/2006/picture">
+                <pic:pic xmlns:pic="http://schemas.openxmlformats.org/drawingml/2006/picture">
+                  <pic:nvPicPr>
+                    <pic:cNvPr id="1779210780" name=""/>
+                    <pic:cNvPicPr/>
+                  </pic:nvPicPr>
+                  <pic:blipFill>
+                    <a:blip r:embed="rId9"/>
+                    <a:stretch>
+                      <a:fillRect/>
+                    </a:stretch>
+                  </pic:blipFill>
+                  <pic:spPr>
+                    <a:xfrm>
+                      <a:off x="0" y="0"/>
+                      <a:ext cx="4443730" cy="8258810"/>
+                    </a:xfrm>
+                    <a:prstGeom prst="rect">
+                      <a:avLst/>
+                    </a:prstGeom>
+                  </pic:spPr>
+                </pic:pic>
+              </a:graphicData>
+            </a:graphic>
+          </wp:inline>
+        </w:drawing>
+      </w:r>
+    </w:p>
+    <w:p>
+      <w:pPr>
+        <w:pStyle w:val="Prrafodelista"/>
+        <w:numPr>
+          <w:ilvl w:val="0"/>
+          <w:numId w:val="5"/>
+        </w:numPr>
+        <w:rPr>
+          <w:lang w:val="es-MX"/>
+        </w:rPr>
+      </w:pPr>
+      <w:r>
+        <w:rPr>
+          <w:lang w:val="es-MX"/>
+        </w:rPr>
+        <w:lastRenderedPageBreak/>
+        <w:t xml:space="preserve">Prop </w:t>
+      </w:r>
+      <w:r>
+        <w:rPr>
+          <w:i/>
+          <w:iCs/>
+          <w:lang w:val="es-MX"/>
+        </w:rPr>
+        <w:t>itemLabel</w:t>
+      </w:r>
+      <w:r>
+        <w:rPr>
+          <w:lang w:val="es-MX"/>
+        </w:rPr>
+        <w:t xml:space="preserve"> no tiene ningun efecto visual</w:t>
+      </w:r>
+    </w:p>
+    <w:p>
+      <w:pPr>
+        <w:pStyle w:val="Ttulo4"/>
+        <w:rPr>
+          <w:rFonts w:ascii="Apple Color Emoji" w:hAnsi="Apple Color Emoji"/>
+          <w:lang w:val="es-MX"/>
+        </w:rPr>
+      </w:pPr>
+      <w:r>
+        <w:rPr>
+          <w:lang w:val="es-MX"/>
+        </w:rPr>
+        <w:t xml:space="preserve">Expansion </w:t>
+      </w:r>
+      <w:r>
+        <w:rPr>
+          <w:rFonts w:ascii="Apple Color Emoji" w:hAnsi="Apple Color Emoji"/>
+          <w:lang w:val="es-MX"/>
+        </w:rPr>
+        <w:t>✅</w:t>
+      </w:r>
+    </w:p>
+    <w:p>
+      <w:pPr>
+        <w:pStyle w:val="Ttulo3"/>
+        <w:rPr>
+          <w:lang w:val="es-MX"/>
+        </w:rPr>
+      </w:pPr>
+      <w:r>
+        <w:rPr>
+          <w:lang w:val="es-MX"/>
+        </w:rPr>
+        <w:t>DataDisplay</w:t>
+      </w:r>
+    </w:p>
+    <w:p>
+      <w:pPr>
+        <w:rPr>
+          <w:lang w:val="es-MX"/>
+        </w:rPr>
+      </w:pPr>
+    </w:p>
+    <w:p>
+      <w:pPr>
+        <w:rPr>
+          <w:lang w:val="es-MX"/>
+        </w:rPr>
+      </w:pPr>
+    </w:p>
+    <w:p>
+      <w:pPr>
+        <w:rPr>
+          <w:lang w:val="es-MX"/>
+        </w:rPr>
+      </w:pPr>
+    </w:p>
+    <w:p>
+      <w:pPr>
+        <w:rPr>
+          <w:lang w:val="es-MX"/>
+        </w:rPr>
+      </w:pPr>
+    </w:p>
+    <w:p>
+      <w:pPr>
+        <w:rPr>
+          <w:lang w:val="es-MX"/>
+        </w:rPr>
+      </w:pPr>
+    </w:p>
+    <w:p>
+      <w:pPr>
+        <w:rPr>
+          <w:lang w:val="es-MX"/>
+        </w:rPr>
+      </w:pPr>
+    </w:p>
+    <w:p>
+      <w:pPr>
+        <w:rPr>
+          <w:lang w:val="es-MX"/>
+        </w:rPr>
+      </w:pPr>
+    </w:p>
+    <w:p>
+      <w:pPr>
+        <w:rPr>
+          <w:lang w:val="es-MX"/>
+        </w:rPr>
+      </w:pPr>
+    </w:p>
+    <w:p>
+      <w:pPr>
+        <w:rPr>
+          <w:lang w:val="es-MX"/>
+        </w:rPr>
+      </w:pPr>
+    </w:p>
+    <w:p>
+      <w:pPr>
+        <w:rPr>
+          <w:lang w:val="es-MX"/>
+        </w:rPr>
+      </w:pPr>
+    </w:p>
+    <w:p>
+      <w:pPr>
+        <w:rPr>
+          <w:lang w:val="es-MX"/>
+        </w:rPr>
+      </w:pPr>
+    </w:p>
     <w:p/>
     <w:sectPr>
       <w:pgSz w:w="12240" w:h="15840"/>
@@ -720,6 +1290,118 @@
       <w:lvlJc w:val="left"/>
     </w:lvl>
   </w:abstractNum>
+  <w:abstractNum w:abstractNumId="4" w15:restartNumberingAfterBreak="0">
+    <w:nsid w:val="1A167E6D"/>
+    <w:multiLevelType w:val="hybridMultilevel"/>
+    <w:tmpl w:val="EBC69FC0"/>
+    <w:lvl w:ilvl="0" w:tplc="5A8C3A66">
+      <w:numFmt w:val="bullet"/>
+      <w:lvlText w:val="-"/>
+      <w:lvlJc w:val="left"/>
+      <w:pPr>
+        <w:ind w:left="720" w:hanging="360"/>
+      </w:pPr>
+      <w:rPr>
+        <w:rFonts w:ascii="Aptos" w:eastAsiaTheme="minorHAnsi" w:hAnsi="Aptos" w:cstheme="minorBidi" w:hint="default"/>
+      </w:rPr>
+    </w:lvl>
+    <w:lvl w:ilvl="1" w:tplc="080A0003" w:tentative="1">
+      <w:start w:val="1"/>
+      <w:numFmt w:val="bullet"/>
+      <w:lvlText w:val="o"/>
+      <w:lvlJc w:val="left"/>
+      <w:pPr>
+        <w:ind w:left="1440" w:hanging="360"/>
+      </w:pPr>
+      <w:rPr>
+        <w:rFonts w:ascii="Courier New" w:hAnsi="Courier New" w:hint="default"/>
+      </w:rPr>
+    </w:lvl>
+    <w:lvl w:ilvl="2" w:tplc="080A0005" w:tentative="1">
+      <w:start w:val="1"/>
+      <w:numFmt w:val="bullet"/>
+      <w:lvlText w:val=""/>
+      <w:lvlJc w:val="left"/>
+      <w:pPr>
+        <w:ind w:left="2160" w:hanging="360"/>
+      </w:pPr>
+      <w:rPr>
+        <w:rFonts w:ascii="Wingdings" w:hAnsi="Wingdings" w:hint="default"/>
+      </w:rPr>
+    </w:lvl>
+    <w:lvl w:ilvl="3" w:tplc="080A0001" w:tentative="1">
+      <w:start w:val="1"/>
+      <w:numFmt w:val="bullet"/>
+      <w:lvlText w:val=""/>
+      <w:lvlJc w:val="left"/>
+      <w:pPr>
+        <w:ind w:left="2880" w:hanging="360"/>
+      </w:pPr>
+      <w:rPr>
+        <w:rFonts w:ascii="Symbol" w:hAnsi="Symbol" w:hint="default"/>
+      </w:rPr>
+    </w:lvl>
+    <w:lvl w:ilvl="4" w:tplc="080A0003" w:tentative="1">
+      <w:start w:val="1"/>
+      <w:numFmt w:val="bullet"/>
+      <w:lvlText w:val="o"/>
+      <w:lvlJc w:val="left"/>
+      <w:pPr>
+        <w:ind w:left="3600" w:hanging="360"/>
+      </w:pPr>
+      <w:rPr>
+        <w:rFonts w:ascii="Courier New" w:hAnsi="Courier New" w:hint="default"/>
+      </w:rPr>
+    </w:lvl>
+    <w:lvl w:ilvl="5" w:tplc="080A0005" w:tentative="1">
+      <w:start w:val="1"/>
+      <w:numFmt w:val="bullet"/>
+      <w:lvlText w:val=""/>
+      <w:lvlJc w:val="left"/>
+      <w:pPr>
+        <w:ind w:left="4320" w:hanging="360"/>
+      </w:pPr>
+      <w:rPr>
+        <w:rFonts w:ascii="Wingdings" w:hAnsi="Wingdings" w:hint="default"/>
+      </w:rPr>
+    </w:lvl>
+    <w:lvl w:ilvl="6" w:tplc="080A0001" w:tentative="1">
+      <w:start w:val="1"/>
+      <w:numFmt w:val="bullet"/>
+      <w:lvlText w:val=""/>
+      <w:lvlJc w:val="left"/>
+      <w:pPr>
+        <w:ind w:left="5040" w:hanging="360"/>
+      </w:pPr>
+      <w:rPr>
+        <w:rFonts w:ascii="Symbol" w:hAnsi="Symbol" w:hint="default"/>
+      </w:rPr>
+    </w:lvl>
+    <w:lvl w:ilvl="7" w:tplc="080A0003" w:tentative="1">
+      <w:start w:val="1"/>
+      <w:numFmt w:val="bullet"/>
+      <w:lvlText w:val="o"/>
+      <w:lvlJc w:val="left"/>
+      <w:pPr>
+        <w:ind w:left="5760" w:hanging="360"/>
+      </w:pPr>
+      <w:rPr>
+        <w:rFonts w:ascii="Courier New" w:hAnsi="Courier New" w:hint="default"/>
+      </w:rPr>
+    </w:lvl>
+    <w:lvl w:ilvl="8" w:tplc="080A0005" w:tentative="1">
+      <w:start w:val="1"/>
+      <w:numFmt w:val="bullet"/>
+      <w:lvlText w:val=""/>
+      <w:lvlJc w:val="left"/>
+      <w:pPr>
+        <w:ind w:left="6480" w:hanging="360"/>
+      </w:pPr>
+      <w:rPr>
+        <w:rFonts w:ascii="Wingdings" w:hAnsi="Wingdings" w:hint="default"/>
+      </w:rPr>
+    </w:lvl>
+  </w:abstractNum>
   <w:num w:numId="1" w16cid:durableId="64105756">
     <w:abstractNumId w:val="0"/>
   </w:num>
@@ -731,6 +1413,9 @@
   </w:num>
   <w:num w:numId="4" w16cid:durableId="793017349">
     <w:abstractNumId w:val="3"/>
+  </w:num>
+  <w:num w:numId="5" w16cid:durableId="255677713">
+    <w:abstractNumId w:val="4"/>
   </w:num>
 </w:numbering>
 </file>

</xml_diff>

<commit_message>
docs: updated qa report
</commit_message>
<xml_diff>
--- a/Reporte QA.docx
+++ b/Reporte QA.docx
@@ -552,25 +552,26 @@
         <w:pStyle w:val="Ttulo4"/>
         <w:rPr>
           <w:rFonts w:ascii="Apple Color Emoji" w:hAnsi="Apple Color Emoji"/>
-          <w:lang w:val="es-MX"/>
-        </w:rPr>
-      </w:pPr>
-      <w:r>
-        <w:rPr>
-          <w:lang w:val="es-MX"/>
-        </w:rPr>
+          <w:lang w:val="en-US"/>
+        </w:rPr>
+      </w:pPr>
+      <w:r>
+        <w:rPr>
+          <w:lang w:val="en-US"/>
+        </w:rPr>
+        <w:lastRenderedPageBreak/>
         <w:t>Carousel</w:t>
       </w:r>
       <w:r>
         <w:rPr>
-          <w:lang w:val="es-MX"/>
+          <w:lang w:val="en-US"/>
         </w:rPr>
         <w:t xml:space="preserve"> </w:t>
       </w:r>
       <w:r>
         <w:rPr>
           <w:rFonts w:ascii="Apple Color Emoji" w:hAnsi="Apple Color Emoji"/>
-          <w:lang w:val="es-MX"/>
+          <w:lang w:val="en-US"/>
         </w:rPr>
         <w:t>✅</w:t>
       </w:r>
@@ -580,19 +581,19 @@
         <w:pStyle w:val="Ttulo4"/>
         <w:rPr>
           <w:rFonts w:ascii="Apple Color Emoji" w:hAnsi="Apple Color Emoji"/>
-          <w:lang w:val="es-MX"/>
-        </w:rPr>
-      </w:pPr>
-      <w:r>
-        <w:rPr>
-          <w:lang w:val="es-MX"/>
+          <w:lang w:val="en-US"/>
+        </w:rPr>
+      </w:pPr>
+      <w:r>
+        <w:rPr>
+          <w:lang w:val="en-US"/>
         </w:rPr>
         <w:t xml:space="preserve">Expansion </w:t>
       </w:r>
       <w:r>
         <w:rPr>
           <w:rFonts w:ascii="Apple Color Emoji" w:hAnsi="Apple Color Emoji"/>
-          <w:lang w:val="es-MX"/>
+          <w:lang w:val="en-US"/>
         </w:rPr>
         <w:t>✅</w:t>
       </w:r>
@@ -601,29 +602,376 @@
       <w:pPr>
         <w:pStyle w:val="Ttulo3"/>
         <w:rPr>
-          <w:lang w:val="es-MX"/>
-        </w:rPr>
-      </w:pPr>
-      <w:r>
-        <w:rPr>
-          <w:lang w:val="es-MX"/>
+          <w:lang w:val="en-US"/>
+        </w:rPr>
+      </w:pPr>
+      <w:proofErr w:type="spellStart"/>
+      <w:r>
+        <w:rPr>
+          <w:lang w:val="en-US"/>
         </w:rPr>
         <w:t>DataDisplay</w:t>
       </w:r>
-    </w:p>
-    <w:p>
-      <w:pPr>
-        <w:rPr>
-          <w:lang w:val="es-MX"/>
-        </w:rPr>
-      </w:pPr>
-    </w:p>
-    <w:p>
-      <w:pPr>
-        <w:rPr>
-          <w:lang w:val="es-MX"/>
-        </w:rPr>
-      </w:pPr>
+      <w:proofErr w:type="spellEnd"/>
+    </w:p>
+    <w:p>
+      <w:pPr>
+        <w:pStyle w:val="Ttulo4"/>
+        <w:rPr>
+          <w:rFonts w:ascii="Apple Color Emoji" w:hAnsi="Apple Color Emoji"/>
+          <w:lang w:val="en-US"/>
+        </w:rPr>
+      </w:pPr>
+      <w:r>
+        <w:rPr>
+          <w:lang w:val="en-US"/>
+        </w:rPr>
+        <w:t>Amount</w:t>
+      </w:r>
+      <w:r>
+        <w:rPr>
+          <w:lang w:val="en-US"/>
+        </w:rPr>
+        <w:t xml:space="preserve"> </w:t>
+      </w:r>
+      <w:r>
+        <w:rPr>
+          <w:rFonts w:ascii="Apple Color Emoji" w:hAnsi="Apple Color Emoji"/>
+          <w:lang w:val="en-US"/>
+        </w:rPr>
+        <w:t>✅</w:t>
+      </w:r>
+    </w:p>
+    <w:p>
+      <w:pPr>
+        <w:pStyle w:val="Ttulo4"/>
+        <w:rPr>
+          <w:rFonts w:ascii="Apple Color Emoji" w:hAnsi="Apple Color Emoji"/>
+          <w:lang w:val="en-US"/>
+        </w:rPr>
+      </w:pPr>
+      <w:r>
+        <w:rPr>
+          <w:lang w:val="en-US"/>
+        </w:rPr>
+        <w:t>Avatar</w:t>
+      </w:r>
+      <w:r>
+        <w:rPr>
+          <w:rFonts w:ascii="Apple Color Emoji" w:hAnsi="Apple Color Emoji"/>
+          <w:lang w:val="en-US"/>
+        </w:rPr>
+        <w:t>✅</w:t>
+      </w:r>
+    </w:p>
+    <w:p>
+      <w:pPr>
+        <w:pStyle w:val="Ttulo4"/>
+        <w:rPr>
+          <w:rFonts w:ascii="Apple Color Emoji" w:hAnsi="Apple Color Emoji"/>
+          <w:lang w:val="en-US"/>
+        </w:rPr>
+      </w:pPr>
+      <w:proofErr w:type="spellStart"/>
+      <w:r>
+        <w:rPr>
+          <w:lang w:val="en-US"/>
+        </w:rPr>
+        <w:t>AvatarGroup</w:t>
+      </w:r>
+      <w:proofErr w:type="spellEnd"/>
+      <w:r>
+        <w:rPr>
+          <w:lang w:val="en-US"/>
+        </w:rPr>
+        <w:t xml:space="preserve"> </w:t>
+      </w:r>
+      <w:r>
+        <w:rPr>
+          <w:rFonts w:ascii="Apple Color Emoji" w:hAnsi="Apple Color Emoji"/>
+          <w:lang w:val="en-US"/>
+        </w:rPr>
+        <w:t>✅</w:t>
+      </w:r>
+    </w:p>
+    <w:p>
+      <w:pPr>
+        <w:pStyle w:val="Ttulo4"/>
+        <w:rPr>
+          <w:rFonts w:ascii="Apple Color Emoji" w:hAnsi="Apple Color Emoji"/>
+          <w:lang w:val="es-MX"/>
+        </w:rPr>
+      </w:pPr>
+      <w:r>
+        <w:rPr>
+          <w:lang w:val="es-MX"/>
+        </w:rPr>
+        <w:t>AvatarIndicator</w:t>
+      </w:r>
+      <w:r>
+        <w:rPr>
+          <w:rFonts w:ascii="Apple Color Emoji" w:hAnsi="Apple Color Emoji"/>
+          <w:lang w:val="es-MX"/>
+        </w:rPr>
+        <w:t>✅</w:t>
+      </w:r>
+    </w:p>
+    <w:p>
+      <w:pPr>
+        <w:pStyle w:val="Ttulo4"/>
+        <w:rPr>
+          <w:rFonts w:ascii="Apple Color Emoji" w:hAnsi="Apple Color Emoji"/>
+          <w:lang w:val="es-MX"/>
+        </w:rPr>
+      </w:pPr>
+      <w:r>
+        <w:rPr>
+          <w:lang w:val="es-MX"/>
+        </w:rPr>
+        <w:t>Badge</w:t>
+      </w:r>
+      <w:r>
+        <w:rPr>
+          <w:rFonts w:ascii="Apple Color Emoji" w:hAnsi="Apple Color Emoji"/>
+          <w:lang w:val="es-MX"/>
+        </w:rPr>
+        <w:t>✅</w:t>
+      </w:r>
+    </w:p>
+    <w:p>
+      <w:pPr>
+        <w:pStyle w:val="Ttulo4"/>
+        <w:rPr>
+          <w:lang w:val="es-MX"/>
+        </w:rPr>
+      </w:pPr>
+      <w:r>
+        <w:rPr>
+          <w:lang w:val="es-MX"/>
+        </w:rPr>
+        <w:t>Image</w:t>
+      </w:r>
+    </w:p>
+    <w:p>
+      <w:pPr>
+        <w:pStyle w:val="Prrafodelista"/>
+        <w:numPr>
+          <w:ilvl w:val="0"/>
+          <w:numId w:val="5"/>
+        </w:numPr>
+        <w:rPr>
+          <w:lang w:val="es-MX"/>
+        </w:rPr>
+      </w:pPr>
+      <w:r>
+        <w:rPr>
+          <w:lang w:val="es-MX"/>
+        </w:rPr>
+        <w:t>Placeholder animado de cargando no funciona</w:t>
+      </w:r>
+    </w:p>
+    <w:p>
+      <w:pPr>
+        <w:pStyle w:val="Prrafodelista"/>
+        <w:numPr>
+          <w:ilvl w:val="0"/>
+          <w:numId w:val="5"/>
+        </w:numPr>
+        <w:rPr>
+          <w:lang w:val="es-MX"/>
+        </w:rPr>
+      </w:pPr>
+      <w:r>
+        <w:rPr>
+          <w:lang w:val="es-MX"/>
+        </w:rPr>
+        <w:t>No tiene lazy loading</w:t>
+      </w:r>
+    </w:p>
+    <w:p>
+      <w:pPr>
+        <w:pStyle w:val="Ttulo4"/>
+        <w:rPr>
+          <w:lang w:val="es-MX"/>
+        </w:rPr>
+      </w:pPr>
+      <w:r>
+        <w:rPr>
+          <w:lang w:val="es-MX"/>
+        </w:rPr>
+        <w:t>Map</w:t>
+      </w:r>
+    </w:p>
+    <w:p>
+      <w:pPr>
+        <w:pStyle w:val="Prrafodelista"/>
+        <w:numPr>
+          <w:ilvl w:val="0"/>
+          <w:numId w:val="5"/>
+        </w:numPr>
+        <w:rPr>
+          <w:lang w:val="es-MX"/>
+        </w:rPr>
+      </w:pPr>
+      <w:r>
+        <w:rPr>
+          <w:lang w:val="es-MX"/>
+        </w:rPr>
+        <w:t>No es un mapa real</w:t>
+      </w:r>
+    </w:p>
+    <w:p>
+      <w:pPr>
+        <w:pStyle w:val="Ttulo4"/>
+        <w:rPr>
+          <w:lang w:val="es-MX"/>
+        </w:rPr>
+      </w:pPr>
+      <w:r>
+        <w:rPr>
+          <w:lang w:val="es-MX"/>
+        </w:rPr>
+        <w:t>MapPin</w:t>
+      </w:r>
+    </w:p>
+    <w:p>
+      <w:pPr>
+        <w:pStyle w:val="Prrafodelista"/>
+        <w:numPr>
+          <w:ilvl w:val="0"/>
+          <w:numId w:val="5"/>
+        </w:numPr>
+        <w:rPr>
+          <w:lang w:val="es-MX"/>
+        </w:rPr>
+      </w:pPr>
+      <w:r>
+        <w:rPr>
+          <w:lang w:val="es-MX"/>
+        </w:rPr>
+        <w:t xml:space="preserve">No </w:t>
+      </w:r>
+      <w:r>
+        <w:rPr>
+          <w:lang w:val="es-MX"/>
+        </w:rPr>
+        <w:t>son pines reales del mapa</w:t>
+      </w:r>
+    </w:p>
+    <w:p>
+      <w:pPr>
+        <w:pStyle w:val="Ttulo4"/>
+        <w:rPr>
+          <w:rFonts w:ascii="Apple Color Emoji" w:hAnsi="Apple Color Emoji"/>
+          <w:lang w:val="es-MX"/>
+        </w:rPr>
+      </w:pPr>
+      <w:r>
+        <w:rPr>
+          <w:lang w:val="es-MX"/>
+        </w:rPr>
+        <w:t>MerchantAvatar</w:t>
+      </w:r>
+      <w:r>
+        <w:rPr>
+          <w:rFonts w:eastAsiaTheme="minorHAnsi" w:cstheme="minorBidi"/>
+          <w:i w:val="0"/>
+          <w:iCs w:val="0"/>
+          <w:color w:val="auto"/>
+          <w:lang w:val="es-MX"/>
+        </w:rPr>
+        <w:t xml:space="preserve"> </w:t>
+      </w:r>
+      <w:r>
+        <w:rPr>
+          <w:rFonts w:ascii="Apple Color Emoji" w:eastAsiaTheme="minorHAnsi" w:hAnsi="Apple Color Emoji" w:cstheme="minorBidi"/>
+          <w:i w:val="0"/>
+          <w:iCs w:val="0"/>
+          <w:color w:val="auto"/>
+          <w:lang w:val="es-MX"/>
+        </w:rPr>
+        <w:t>✅</w:t>
+      </w:r>
+    </w:p>
+    <w:p>
+      <w:pPr>
+        <w:pStyle w:val="Ttulo4"/>
+        <w:rPr>
+          <w:rFonts w:ascii="Apple Color Emoji" w:hAnsi="Apple Color Emoji"/>
+          <w:lang w:val="es-MX"/>
+        </w:rPr>
+      </w:pPr>
+      <w:r>
+        <w:rPr>
+          <w:lang w:val="es-MX"/>
+        </w:rPr>
+        <w:t>Tag</w:t>
+      </w:r>
+      <w:r>
+        <w:rPr>
+          <w:lang w:val="es-MX"/>
+        </w:rPr>
+        <w:t xml:space="preserve"> </w:t>
+      </w:r>
+      <w:r>
+        <w:rPr>
+          <w:rFonts w:ascii="Apple Color Emoji" w:hAnsi="Apple Color Emoji"/>
+          <w:lang w:val="es-MX"/>
+        </w:rPr>
+        <w:t>✅</w:t>
+      </w:r>
+    </w:p>
+    <w:p>
+      <w:pPr>
+        <w:pStyle w:val="Ttulo4"/>
+        <w:rPr>
+          <w:lang w:val="es-MX"/>
+        </w:rPr>
+      </w:pPr>
+      <w:r>
+        <w:rPr>
+          <w:lang w:val="es-MX"/>
+        </w:rPr>
+        <w:t>Tag</w:t>
+      </w:r>
+      <w:r>
+        <w:rPr>
+          <w:lang w:val="es-MX"/>
+        </w:rPr>
+        <w:t>s</w:t>
+      </w:r>
+      <w:r>
+        <w:rPr>
+          <w:lang w:val="es-MX"/>
+        </w:rPr>
+        <w:t>Group</w:t>
+      </w:r>
+      <w:r>
+        <w:rPr>
+          <w:rFonts w:eastAsiaTheme="minorHAnsi" w:cstheme="minorBidi"/>
+          <w:i w:val="0"/>
+          <w:iCs w:val="0"/>
+          <w:color w:val="auto"/>
+          <w:lang w:val="es-MX"/>
+        </w:rPr>
+        <w:t xml:space="preserve"> </w:t>
+      </w:r>
+      <w:r>
+        <w:rPr>
+          <w:rFonts w:ascii="Apple Color Emoji" w:eastAsiaTheme="minorHAnsi" w:hAnsi="Apple Color Emoji" w:cstheme="minorBidi"/>
+          <w:i w:val="0"/>
+          <w:iCs w:val="0"/>
+          <w:color w:val="auto"/>
+          <w:lang w:val="es-MX"/>
+        </w:rPr>
+        <w:t>✅</w:t>
+      </w:r>
+      <w:r>
+        <w:rPr>
+          <w:lang w:val="es-MX"/>
+        </w:rPr>
+        <w:t xml:space="preserve"> </w:t>
+      </w:r>
     </w:p>
     <w:p>
       <w:pPr>

</xml_diff>